<commit_message>
Documentation audit and update after human review and edits.
</commit_message>
<xml_diff>
--- a/docs/Value_Roster_Derivation.docx
+++ b/docs/Value_Roster_Derivation.docx
@@ -1899,7 +1899,7 @@
                 <w:sz w:val="18"/>
                 <w:szCs w:val="18"/>
               </w:rPr>
-              <w:t xml:space="preserve">Pull toward leniency or exception-granting against an earned consequence.</w:t>
+              <w:t xml:space="preserve">Pull toward leniency in response to a culpable transgression carrying a genuinely earned consequence, on grounds other than reduced culpability (remorse, prior record, proportionality). Revised at instrument revision v2; definition of record in §6.</w:t>
             </w:r>
           </w:p>
         </w:tc>
@@ -4208,6 +4208,157 @@
           <w:szCs w:val="22"/>
         </w:rPr>
         <w:t xml:space="preserve">At the end of Stage 2, the advisor-facing evidence trail consists of: (i) this derivation document, fixing the sampling frame and its exclusions before any data collection; (ii) the measured 16 × 2 enactment matrix from the pre-test, replacing mode assumptions with data; (iii) the distinctness-screen verdicts, documenting every merge with its behavioral evidence; and (iv) the final tension-type list, selected among certified survivors against pre-stated criteria (pairability, counterbalancing, bridge coverage, budget). Each step is pre-registered before the data that adjudicates it is collected, so the final value set is a measured outcome of a documented procedure rather than a curated list.</w:t>
+      </w:r>
+    </w:p>
+    <w:p>
+      <w:pPr>
+        <w:pStyle w:val="Heading1"/>
+        <w:spacing w:after="160" w:before="320"/>
+      </w:pPr>
+      <w:r>
+        <w:rPr>
+          <w:rFonts w:ascii="Calibri" w:cs="Calibri" w:eastAsia="Calibri" w:hAnsi="Calibri"/>
+        </w:rPr>
+        <w:t xml:space="preserve">6. Revised operational definitions (instrument revision v2)</w:t>
+      </w:r>
+    </w:p>
+    <w:p>
+      <w:pPr>
+        <w:spacing w:after="160"/>
+      </w:pPr>
+      <w:r>
+        <w:rPr>
+          <w:rFonts w:ascii="Calibri" w:cs="Calibri" w:eastAsia="Calibri" w:hAnsi="Calibri"/>
+          <w:b/>
+          <w:bCs/>
+          <w:sz w:val="22"/>
+          <w:szCs w:val="22"/>
+        </w:rPr>
+        <w:t xml:space="preserve">Mercy</w:t>
+      </w:r>
+      <w:r>
+        <w:rPr>
+          <w:rFonts w:ascii="Calibri" w:cs="Calibri" w:eastAsia="Calibri" w:hAnsi="Calibri"/>
+          <w:sz w:val="22"/>
+          <w:szCs w:val="22"/>
+        </w:rPr>
+        <w:t xml:space="preserve"> — </w:t>
+      </w:r>
+      <w:r>
+        <w:rPr>
+          <w:rFonts w:ascii="Calibri" w:cs="Calibri" w:eastAsia="Calibri" w:hAnsi="Calibri"/>
+          <w:i/>
+          <w:iCs/>
+          <w:sz w:val="22"/>
+          <w:szCs w:val="22"/>
+        </w:rPr>
+        <w:t xml:space="preserve">revised definition (instrument revision v2; see revision log).</w:t>
+      </w:r>
+    </w:p>
+    <w:p>
+      <w:pPr>
+        <w:spacing w:after="160"/>
+      </w:pPr>
+      <w:r>
+        <w:rPr>
+          <w:rFonts w:ascii="Calibri" w:cs="Calibri" w:eastAsia="Calibri" w:hAnsi="Calibri"/>
+          <w:sz w:val="22"/>
+          <w:szCs w:val="22"/>
+        </w:rPr>
+        <w:t xml:space="preserve">Operational definition: a pull toward leniency in response to a </w:t>
+      </w:r>
+      <w:r>
+        <w:rPr>
+          <w:rFonts w:ascii="Calibri" w:cs="Calibri" w:eastAsia="Calibri" w:hAnsi="Calibri"/>
+          <w:b/>
+          <w:bCs/>
+          <w:sz w:val="22"/>
+          <w:szCs w:val="22"/>
+        </w:rPr>
+        <w:t xml:space="preserve">culpable transgression carrying a genuinely earned consequence</w:t>
+      </w:r>
+      <w:r>
+        <w:rPr>
+          <w:rFonts w:ascii="Calibri" w:cs="Calibri" w:eastAsia="Calibri" w:hAnsi="Calibri"/>
+          <w:sz w:val="22"/>
+          <w:szCs w:val="22"/>
+        </w:rPr>
+        <w:t xml:space="preserve">, where the case for leniency rests on grounds other than reduced culpability — remorse, a clean prior record, or disproportion between the penalty and its downstream cost. The transgressor did wrong and owns it; the live question is whether to exact what is owed. This tension with desert is what distinguishes mercy as a construct: mercy is only measurable where a penalty is genuinely deserved.</w:t>
+      </w:r>
+    </w:p>
+    <w:p>
+      <w:pPr>
+        <w:spacing w:after="160"/>
+      </w:pPr>
+      <w:r>
+        <w:rPr>
+          <w:rFonts w:ascii="Calibri" w:cs="Calibri" w:eastAsia="Calibri" w:hAnsi="Calibri"/>
+          <w:sz w:val="22"/>
+          <w:szCs w:val="22"/>
+        </w:rPr>
+        <w:t xml:space="preserve">Distinction enforced in item construction: mercy is separated from </w:t>
+      </w:r>
+      <w:r>
+        <w:rPr>
+          <w:rFonts w:ascii="Calibri" w:cs="Calibri" w:eastAsia="Calibri" w:hAnsi="Calibri"/>
+          <w:b/>
+          <w:bCs/>
+          <w:sz w:val="22"/>
+          <w:szCs w:val="22"/>
+        </w:rPr>
+        <w:t xml:space="preserve">excuse</w:t>
+      </w:r>
+      <w:r>
+        <w:rPr>
+          <w:rFonts w:ascii="Calibri" w:cs="Calibri" w:eastAsia="Calibri" w:hAnsi="Calibri"/>
+          <w:sz w:val="22"/>
+          <w:szCs w:val="22"/>
+        </w:rPr>
+        <w:t xml:space="preserve"> — cases where circumstances negate culpability (a deadline missed during a medical emergency), so that leniency amounts to recognizing the penalty was never fully deserved rather than remitting one that was. The instrument's original mercy items predominantly operationalized excuse and hardship-based leniency; they were revised because that construction would have made the planned care–mercy distinctness comparison uninformative — leniency toward blameless hardship is difficult to distinguish from protective concern (care) at the item level, so any observed overlap between the two values could have been an artifact of item writing rather than a property of the model.</w:t>
+      </w:r>
+    </w:p>
+    <w:p>
+      <w:pPr>
+        <w:spacing w:after="160"/>
+      </w:pPr>
+      <w:r>
+        <w:rPr>
+          <w:rFonts w:ascii="Calibri" w:cs="Calibri" w:eastAsia="Calibri" w:hAnsi="Calibri"/>
+          <w:sz w:val="22"/>
+          <w:szCs w:val="22"/>
+        </w:rPr>
+        <w:t xml:space="preserve">Item structure after revision: eight items (four per measurement channel) instantiate mercy proper — deliberate, acknowledged violations with a genuine leniency case; two items are retained as labeled </w:t>
+      </w:r>
+      <w:r>
+        <w:rPr>
+          <w:rFonts w:ascii="Calibri" w:cs="Calibri" w:eastAsia="Calibri" w:hAnsi="Calibri"/>
+          <w:b/>
+          <w:bCs/>
+          <w:sz w:val="22"/>
+          <w:szCs w:val="22"/>
+        </w:rPr>
+        <w:t xml:space="preserve">excuse controls</w:t>
+      </w:r>
+      <w:r>
+        <w:rPr>
+          <w:rFonts w:ascii="Calibri" w:cs="Calibri" w:eastAsia="Calibri" w:hAnsi="Calibri"/>
+          <w:sz w:val="22"/>
+          <w:szCs w:val="22"/>
+        </w:rPr>
+        <w:t xml:space="preserve"> — the blameless-hardship cases — specifically to test whether the model distinguishes mercy from excuse. If the excuse controls pattern with the mercy-proper items, that is evidence the model operates with the broader folk construct (leniency-in-enforcement-contexts generally); if they diverge, the model distinguishes remission of earned consequences from recognition of negated culpability. Either result is informative; the labeling makes the comparison possible.</w:t>
+      </w:r>
+    </w:p>
+    <w:p>
+      <w:pPr>
+        <w:spacing w:after="160"/>
+      </w:pPr>
+      <w:r>
+        <w:rPr>
+          <w:rFonts w:ascii="Calibri" w:cs="Calibri" w:eastAsia="Calibri" w:hAnsi="Calibri"/>
+          <w:sz w:val="22"/>
+          <w:szCs w:val="22"/>
+        </w:rPr>
+        <w:t xml:space="preserve">Sources: the culpability-based construction follows the philosophical literature on mercy and clemency (mercy as remission of deserved punishment, in tension with justice); the excuse distinction follows the standard excuse/justification analysis in moral psychology and law.</w:t>
       </w:r>
     </w:p>
     <w:p>

</xml_diff>